<commit_message>
Highlight handwritten OCR text in yellow in docx results
Compared each scanned PDF page with the OCR docx output and marked only
text recognized from handwriting (numbers, dates, names, table entries,
notes) with yellow highlight. АЭ4043 ЭТ already had reference highlighting
and was left unchanged.

Co-Authored-By: Claude Opus 5.5 <noreply@anthropic.com>
</commit_message>
<xml_diff>
--- a/ocr_results/1. ОБРАЗЦЫ РУКОПИСНОГО ТЕКСТА/АЭ5880ПС.docx
+++ b/ocr_results/1. ОБРАЗЦЫ РУКОПИСНОГО ТЕКСТА/АЭ5880ПС.docx
@@ -7,7 +7,9 @@
         <w:pStyle w:val="Heading1"/>
       </w:pPr>
       <w:r>
-        <w:rPr/>
+        <w:rPr>
+          <w:highlight w:val="yellow"/>
+        </w:rPr>
         <w:t>НА 35-3 (номер не виден)</w:t>
       </w:r>
     </w:p>
@@ -28,7 +30,13 @@
           <w:p>
             <w:r>
               <w:rPr/>
-              <w:t>Инв. № 06453/7983</w:t>
+              <w:t xml:space="preserve">Инв. № </w:t>
+            </w:r>
+            <w:r>
+              <w:rPr>
+                <w:highlight w:val="yellow"/>
+              </w:rPr>
+              <w:t>06453/7983</w:t>
             </w:r>
           </w:p>
         </w:tc>
@@ -53,7 +61,9 @@
         <w:pStyle w:val="Heading1"/>
       </w:pPr>
       <w:r>
-        <w:rPr/>
+        <w:rPr>
+          <w:highlight w:val="yellow"/>
+        </w:rPr>
         <w:t>АИСГУ-01</w:t>
       </w:r>
     </w:p>
@@ -66,7 +76,13 @@
     <w:p>
       <w:r>
         <w:rPr/>
-        <w:t>Заводской № 1CS</w:t>
+        <w:t xml:space="preserve">Заводской № </w:t>
+      </w:r>
+      <w:r>
+        <w:rPr>
+          <w:highlight w:val="yellow"/>
+        </w:rPr>
+        <w:t>1CS</w:t>
       </w:r>
     </w:p>
     <w:p>
@@ -83,7 +99,9 @@
         <w:pStyle w:val="Heading1"/>
       </w:pPr>
       <w:r>
-        <w:rPr/>
+        <w:rPr>
+          <w:highlight w:val="yellow"/>
+        </w:rPr>
         <w:t>ФЕЗИР-1</w:t>
       </w:r>
     </w:p>
@@ -124,19 +142,99 @@
     <w:p>
       <w:r>
         <w:rPr/>
-        <w:t>- при температуре от минус 10 °C до плюс 50 °C при любом сочетании относительной влажности воздуха и температуры, возможном в естественных климатических условиях территории Российской Федерации;</w:t>
+        <w:t xml:space="preserve">- при температуре от минус </w:t>
+      </w:r>
+      <w:r>
+        <w:rPr>
+          <w:highlight w:val="yellow"/>
+        </w:rPr>
+        <w:t>10</w:t>
+      </w:r>
+      <w:r>
+        <w:rPr/>
+        <w:t xml:space="preserve"> °C до плюс </w:t>
+      </w:r>
+      <w:r>
+        <w:rPr>
+          <w:highlight w:val="yellow"/>
+        </w:rPr>
+        <w:t>50</w:t>
+      </w:r>
+      <w:r>
+        <w:rPr/>
+        <w:t xml:space="preserve"> °C при любом сочетании относительной влажности воздуха и температуры, возможном в естественных климатических условиях территории Российской Федерации;</w:t>
       </w:r>
     </w:p>
     <w:p>
       <w:r>
         <w:rPr/>
-        <w:t>- при атмосферном давлении 6,13 × 10⁴ Па (460 мм рт. ст.) и после воздействия пониженного атмосферного давления 1,2 × 10⁴ Па (90 мм рт. ст.);</w:t>
+        <w:t xml:space="preserve">- при атмосферном давлении </w:t>
+      </w:r>
+      <w:r>
+        <w:rPr>
+          <w:highlight w:val="yellow"/>
+        </w:rPr>
+        <w:t>6,13 × 10⁴</w:t>
+      </w:r>
+      <w:r>
+        <w:rPr/>
+        <w:t xml:space="preserve"> Па (</w:t>
+      </w:r>
+      <w:r>
+        <w:rPr>
+          <w:highlight w:val="yellow"/>
+        </w:rPr>
+        <w:t>460</w:t>
+      </w:r>
+      <w:r>
+        <w:rPr/>
+        <w:t xml:space="preserve"> мм рт. ст.) и после воздействия пониженного атмосферного давления </w:t>
+      </w:r>
+      <w:r>
+        <w:rPr>
+          <w:highlight w:val="yellow"/>
+        </w:rPr>
+        <w:t>1,2 × 10⁴</w:t>
+      </w:r>
+      <w:r>
+        <w:rPr/>
+        <w:t xml:space="preserve"> Па (</w:t>
+      </w:r>
+      <w:r>
+        <w:rPr>
+          <w:highlight w:val="yellow"/>
+        </w:rPr>
+        <w:t>90</w:t>
+      </w:r>
+      <w:r>
+        <w:rPr/>
+        <w:t xml:space="preserve"> мм рт. ст.);</w:t>
       </w:r>
     </w:p>
     <w:p>
       <w:r>
         <w:rPr/>
-        <w:t>— после пребывания при температуре внешней среды от минус 10 °С до минус 50 °С;</w:t>
+        <w:t xml:space="preserve">— после пребывания при температуре внешней среды от </w:t>
+      </w:r>
+      <w:r>
+        <w:rPr>
+          <w:highlight w:val="yellow"/>
+        </w:rPr>
+        <w:t>минус 10</w:t>
+      </w:r>
+      <w:r>
+        <w:rPr/>
+        <w:t xml:space="preserve"> °С до </w:t>
+      </w:r>
+      <w:r>
+        <w:rPr>
+          <w:highlight w:val="yellow"/>
+        </w:rPr>
+        <w:t>минус 50</w:t>
+      </w:r>
+      <w:r>
+        <w:rPr/>
+        <w:t xml:space="preserve"> °С;</w:t>
       </w:r>
     </w:p>
     <w:p>
@@ -148,55 +246,92 @@
     <w:p>
       <w:r>
         <w:rPr/>
-        <w:t>1.2 Габаритные размеры тары: ___ мм.</w:t>
+        <w:t xml:space="preserve">1.2 Габаритные размеры тары: </w:t>
+      </w:r>
+      <w:r>
+        <w:rPr>
+          <w:highlight w:val="yellow"/>
+        </w:rPr>
+        <w:t>___</w:t>
+      </w:r>
+      <w:r>
+        <w:rPr/>
+        <w:t xml:space="preserve"> мм.</w:t>
       </w:r>
     </w:p>
     <w:p>
       <w:r>
         <w:rPr/>
-        <w:t>1.3 Масса тары с изделием не более __ кг.</w:t>
+        <w:t xml:space="preserve">1.3 Масса тары с изделием не более </w:t>
+      </w:r>
+      <w:r>
+        <w:rPr>
+          <w:highlight w:val="yellow"/>
+        </w:rPr>
+        <w:t>__</w:t>
+      </w:r>
+      <w:r>
+        <w:rPr/>
+        <w:t xml:space="preserve"> кг.</w:t>
       </w:r>
     </w:p>
     <w:p>
       <w:r>
-        <w:rPr/>
+        <w:rPr>
+          <w:highlight w:val="yellow"/>
+        </w:rPr>
         <w:t>Своецкие орнаментальные материалы и цветные металлы.</w:t>
       </w:r>
     </w:p>
     <w:p>
       <w:r>
-        <w:rPr/>
+        <w:rPr>
+          <w:highlight w:val="yellow"/>
+        </w:rPr>
         <w:t>Золото — 0,1925 г;</w:t>
       </w:r>
     </w:p>
     <w:p>
       <w:r>
-        <w:rPr/>
+        <w:rPr>
+          <w:highlight w:val="yellow"/>
+        </w:rPr>
         <w:t>серебро — 1,89 г;</w:t>
       </w:r>
     </w:p>
     <w:p>
       <w:r>
-        <w:rPr/>
+        <w:rPr>
+          <w:highlight w:val="yellow"/>
+        </w:rPr>
         <w:t>медь и сплавы на медной основе — 2,35 г.</w:t>
       </w:r>
     </w:p>
     <w:p>
       <w:r>
-        <w:rPr/>
+        <w:rPr>
+          <w:highlight w:val="yellow"/>
+        </w:rPr>
         <w:t>Места расположения составных частей:</w:t>
       </w:r>
     </w:p>
     <w:p>
       <w:r>
-        <w:rPr/>
+        <w:rPr>
+          <w:highlight w:val="yellow"/>
+        </w:rPr>
         <w:t xml:space="preserve">которые содержат цветные схематики, </w:t>
       </w:r>
       <w:r>
+        <w:rPr>
+          <w:highlight w:val="yellow"/>
+        </w:rPr>
         <w:br/>
       </w:r>
       <w:r>
-        <w:rPr/>
+        <w:rPr>
+          <w:highlight w:val="yellow"/>
+        </w:rPr>
         <w:t xml:space="preserve"> определены по ГОСТ на извещение.</w:t>
       </w:r>
     </w:p>
@@ -334,14 +469,18 @@
           </w:tcPr>
           <w:p>
             <w:r>
-              <w:rPr/>
+              <w:rPr>
+                <w:highlight w:val="yellow"/>
+              </w:rPr>
               <w:t>АЭ588С</w:t>
             </w:r>
             <w:r>
               <w:br/>
             </w:r>
             <w:r>
-              <w:rPr/>
+              <w:rPr>
+                <w:highlight w:val="yellow"/>
+              </w:rPr>
               <w:t>АЭ588СПС</w:t>
             </w:r>
           </w:p>
@@ -352,14 +491,18 @@
           </w:tcPr>
           <w:p>
             <w:r>
-              <w:rPr/>
+              <w:rPr>
+                <w:highlight w:val="yellow"/>
+              </w:rPr>
               <w:t>ЖКГУМ</w:t>
             </w:r>
             <w:r>
               <w:br/>
             </w:r>
             <w:r>
-              <w:rPr/>
+              <w:rPr>
+                <w:highlight w:val="yellow"/>
+              </w:rPr>
               <w:t>Паспорт</w:t>
             </w:r>
           </w:p>
@@ -370,14 +513,18 @@
           </w:tcPr>
           <w:p>
             <w:r>
-              <w:rPr/>
+              <w:rPr>
+                <w:highlight w:val="yellow"/>
+              </w:rPr>
               <w:t>-</w:t>
             </w:r>
             <w:r>
               <w:br/>
             </w:r>
             <w:r>
-              <w:rPr/>
+              <w:rPr>
+                <w:highlight w:val="yellow"/>
+              </w:rPr>
               <w:t>-</w:t>
             </w:r>
           </w:p>
@@ -388,14 +535,18 @@
           </w:tcPr>
           <w:p>
             <w:r>
-              <w:rPr/>
+              <w:rPr>
+                <w:highlight w:val="yellow"/>
+              </w:rPr>
               <w:t>1</w:t>
             </w:r>
             <w:r>
               <w:br/>
             </w:r>
             <w:r>
-              <w:rPr/>
+              <w:rPr>
+                <w:highlight w:val="yellow"/>
+              </w:rPr>
               <w:t>1</w:t>
             </w:r>
           </w:p>
@@ -406,14 +557,18 @@
           </w:tcPr>
           <w:p>
             <w:r>
-              <w:rPr/>
+              <w:rPr>
+                <w:highlight w:val="yellow"/>
+              </w:rPr>
               <w:t>1С8</w:t>
             </w:r>
             <w:r>
               <w:br/>
             </w:r>
             <w:r>
-              <w:rPr/>
+              <w:rPr>
+                <w:highlight w:val="yellow"/>
+              </w:rPr>
               <w:t>-</w:t>
             </w:r>
           </w:p>
@@ -424,7 +579,9 @@
           </w:tcPr>
           <w:p>
             <w:r>
-              <w:rPr/>
+              <w:rPr>
+                <w:highlight w:val="yellow"/>
+              </w:rPr>
               <w:t>{АЭ588С-Ш</w:t>
             </w:r>
           </w:p>
@@ -502,13 +659,33 @@
     <w:p>
       <w:r>
         <w:rPr/>
-        <w:t>— проверить целостность электрических цепей в соответствии с таблицей 1 омметром М372 ТУ25-04-1106-75;</w:t>
+        <w:t xml:space="preserve">— проверить целостность электрических цепей в соответствии с таблицей 1 омметром </w:t>
+      </w:r>
+      <w:r>
+        <w:rPr>
+          <w:highlight w:val="yellow"/>
+        </w:rPr>
+        <w:t>М372 ТУ25-04-1106-75</w:t>
+      </w:r>
+      <w:r>
+        <w:rPr/>
+        <w:t>;</w:t>
       </w:r>
     </w:p>
     <w:p>
       <w:r>
         <w:rPr/>
-        <w:t>— проверить сопротивление изоляции между контактами, указанными в таблице 2, а также между этими контактами и корпусом соединителя мегаомметром Е6-16 Я612.722.СН17У;</w:t>
+        <w:t xml:space="preserve">— проверить сопротивление изоляции между контактами, указанными в таблице 2, а также между этими контактами и корпусом соединителя мегаомметром </w:t>
+      </w:r>
+      <w:r>
+        <w:rPr>
+          <w:highlight w:val="yellow"/>
+        </w:rPr>
+        <w:t>Е6-16 Я612.722.СН17У</w:t>
+      </w:r>
+      <w:r>
+        <w:rPr/>
+        <w:t>;</w:t>
       </w:r>
     </w:p>
     <w:p>
@@ -618,7 +795,9 @@
           </w:tcPr>
           <w:p>
             <w:r>
-              <w:rPr/>
+              <w:rPr>
+                <w:highlight w:val="yellow"/>
+              </w:rPr>
               <w:t>смотри привожение</w:t>
             </w:r>
           </w:p>
@@ -744,7 +923,9 @@
           </w:tcPr>
           <w:p>
             <w:r>
-              <w:rPr/>
+              <w:rPr>
+                <w:highlight w:val="yellow"/>
+              </w:rPr>
               <w:t>[неразборчиво] прикосновение</w:t>
             </w:r>
           </w:p>
@@ -755,7 +936,9 @@
           </w:tcPr>
           <w:p>
             <w:r>
-              <w:rPr/>
+              <w:rPr>
+                <w:highlight w:val="yellow"/>
+              </w:rPr>
               <w:t>20</w:t>
             </w:r>
           </w:p>
@@ -766,7 +949,9 @@
           </w:tcPr>
           <w:p>
             <w:r>
-              <w:rPr/>
+              <w:rPr>
+                <w:highlight w:val="yellow"/>
+              </w:rPr>
               <w:t>100</w:t>
             </w:r>
           </w:p>
@@ -882,14 +1067,18 @@
           </w:tcPr>
           <w:p>
             <w:r>
-              <w:rPr/>
+              <w:rPr>
+                <w:highlight w:val="yellow"/>
+              </w:rPr>
               <w:t>1.04.2021</w:t>
             </w:r>
             <w:r>
               <w:br/>
             </w:r>
             <w:r>
-              <w:rPr/>
+              <w:rPr>
+                <w:highlight w:val="yellow"/>
+              </w:rPr>
               <w:t>16.05.2022</w:t>
             </w:r>
           </w:p>
@@ -900,14 +1089,18 @@
           </w:tcPr>
           <w:p>
             <w:r>
-              <w:rPr/>
+              <w:rPr>
+                <w:highlight w:val="yellow"/>
+              </w:rPr>
               <w:t>Осмотр при приеме</w:t>
             </w:r>
             <w:r>
               <w:br/>
             </w:r>
             <w:r>
-              <w:rPr/>
+              <w:rPr>
+                <w:highlight w:val="yellow"/>
+              </w:rPr>
               <w:t>ТО при приеме</w:t>
             </w:r>
           </w:p>
@@ -918,14 +1111,18 @@
           </w:tcPr>
           <w:p>
             <w:r>
-              <w:rPr/>
+              <w:rPr>
+                <w:highlight w:val="yellow"/>
+              </w:rPr>
               <w:t>Инструменты. Замечал нет.</w:t>
             </w:r>
             <w:r>
               <w:br/>
             </w:r>
             <w:r>
-              <w:rPr/>
+              <w:rPr>
+                <w:highlight w:val="yellow"/>
+              </w:rPr>
               <w:t>Загут приведен к дальнейшей эксплуатации</w:t>
             </w:r>
           </w:p>
@@ -936,21 +1133,27 @@
           </w:tcPr>
           <w:p>
             <w:r>
-              <w:rPr/>
+              <w:rPr>
+                <w:highlight w:val="yellow"/>
+              </w:rPr>
               <w:t>Хгср Лопухов 88%</w:t>
             </w:r>
             <w:r>
               <w:br/>
             </w:r>
             <w:r>
-              <w:rPr/>
+              <w:rPr>
+                <w:highlight w:val="yellow"/>
+              </w:rPr>
               <w:t>Си стр Гонтаров</w:t>
             </w:r>
             <w:r>
               <w:br/>
             </w:r>
             <w:r>
-              <w:rPr/>
+              <w:rPr>
+                <w:highlight w:val="yellow"/>
+              </w:rPr>
               <w:t>К СРПАТ и 163 бойковсО</w:t>
             </w:r>
           </w:p>
@@ -961,14 +1164,18 @@
           </w:tcPr>
           <w:p>
             <w:r>
-              <w:rPr/>
+              <w:rPr>
+                <w:highlight w:val="yellow"/>
+              </w:rPr>
               <w:t>АСПТД инв. №4/11233</w:t>
             </w:r>
             <w:r>
               <w:br/>
             </w:r>
             <w:r>
-              <w:rPr/>
+              <w:rPr>
+                <w:highlight w:val="yellow"/>
+              </w:rPr>
               <w:t>ПОЛ инв. 4-209534</w:t>
             </w:r>
           </w:p>
@@ -1051,26 +1258,46 @@
     </w:p>
     <w:p>
       <w:r>
-        <w:rPr/>
+        <w:rPr>
+          <w:highlight w:val="yellow"/>
+        </w:rPr>
         <w:t>[неразборчиво]</w:t>
       </w:r>
     </w:p>
     <w:p>
       <w:r>
-        <w:rPr/>
+        <w:rPr>
+          <w:highlight w:val="yellow"/>
+        </w:rPr>
         <w:t>АЗ5880</w:t>
       </w:r>
     </w:p>
     <w:p>
       <w:r>
         <w:rPr/>
-        <w:t>заводской № 1С8</w:t>
+        <w:t xml:space="preserve">заводской № </w:t>
+      </w:r>
+      <w:r>
+        <w:rPr>
+          <w:highlight w:val="yellow"/>
+        </w:rPr>
+        <w:t>1С8</w:t>
       </w:r>
     </w:p>
     <w:p>
       <w:r>
         <w:rPr/>
-        <w:t>соответствует Спецификации АЗ5880 и признан(а) годным(ой) для эксплуатации.</w:t>
+        <w:t xml:space="preserve">соответствует </w:t>
+      </w:r>
+      <w:r>
+        <w:rPr>
+          <w:highlight w:val="yellow"/>
+        </w:rPr>
+        <w:t>Спецификации АЗ5880</w:t>
+      </w:r>
+      <w:r>
+        <w:rPr/>
+        <w:t xml:space="preserve"> и признан(а) годным(ой) для эксплуатации.</w:t>
       </w:r>
     </w:p>
     <w:p>
@@ -1081,20 +1308,38 @@
     </w:p>
     <w:p>
       <w:r>
-        <w:rPr/>
+        <w:rPr>
+          <w:highlight w:val="yellow"/>
+        </w:rPr>
         <w:t>[неразборчиво] АЗ5880 требованиям</w:t>
       </w:r>
     </w:p>
     <w:p>
       <w:r>
-        <w:rPr/>
-        <w:t>АЗ5880 при соблюдении потребителем условий и правил эксплуатации,</w:t>
+        <w:rPr>
+          <w:highlight w:val="yellow"/>
+        </w:rPr>
+        <w:t>АЗ5880</w:t>
+      </w:r>
+      <w:r>
+        <w:rPr/>
+        <w:t xml:space="preserve"> при соблюдении потребителем условий и правил эксплуатации,</w:t>
       </w:r>
     </w:p>
     <w:p>
       <w:r>
         <w:rPr/>
-        <w:t>установленных общих технических условий ОСТ В 352189-2002.</w:t>
+        <w:t xml:space="preserve">установленных </w:t>
+      </w:r>
+      <w:r>
+        <w:rPr>
+          <w:highlight w:val="yellow"/>
+        </w:rPr>
+        <w:t>общих технических условий ОСТ В 352189-2002</w:t>
+      </w:r>
+      <w:r>
+        <w:rPr/>
+        <w:t>.</w:t>
       </w:r>
     </w:p>
     <w:p>
@@ -1109,7 +1354,27 @@
       </w:pPr>
       <w:r>
         <w:rPr/>
-        <w:t>Гарантийный срок 10 лет исчисляется с даты изготовления.</w:t>
+        <w:t xml:space="preserve">Гарантийный срок </w:t>
+      </w:r>
+      <w:r>
+        <w:rPr>
+          <w:highlight w:val="yellow"/>
+        </w:rPr>
+        <w:t>10</w:t>
+      </w:r>
+      <w:r>
+        <w:rPr/>
+        <w:t xml:space="preserve"> лет исчисляется с </w:t>
+      </w:r>
+      <w:r>
+        <w:rPr>
+          <w:highlight w:val="yellow"/>
+        </w:rPr>
+        <w:t>даты изготовления</w:t>
+      </w:r>
+      <w:r>
+        <w:rPr/>
+        <w:t>.</w:t>
       </w:r>
     </w:p>
     <w:p>
@@ -1121,7 +1386,27 @@
     <w:p>
       <w:r>
         <w:rPr/>
-        <w:t>Директор предприятия 29 сентября 2019г. СЮ ЧЕРНЫЙ</w:t>
+        <w:t xml:space="preserve">Директор предприятия </w:t>
+      </w:r>
+      <w:r>
+        <w:rPr>
+          <w:highlight w:val="yellow"/>
+        </w:rPr>
+        <w:t>29</w:t>
+      </w:r>
+      <w:r>
+        <w:rPr/>
+        <w:t xml:space="preserve"> сентября </w:t>
+      </w:r>
+      <w:r>
+        <w:rPr>
+          <w:highlight w:val="yellow"/>
+        </w:rPr>
+        <w:t>2019г.</w:t>
+      </w:r>
+      <w:r>
+        <w:rPr/>
+        <w:t xml:space="preserve"> СЮ ЧЕРНЫЙ</w:t>
       </w:r>
     </w:p>
     <w:p>
@@ -1133,7 +1418,27 @@
     <w:p>
       <w:r>
         <w:rPr/>
-        <w:t>Начальник ОТК 29 сентября 2019г. А.П. СОБОЛЕВ</w:t>
+        <w:t xml:space="preserve">Начальник ОТК </w:t>
+      </w:r>
+      <w:r>
+        <w:rPr>
+          <w:highlight w:val="yellow"/>
+        </w:rPr>
+        <w:t>29</w:t>
+      </w:r>
+      <w:r>
+        <w:rPr/>
+        <w:t xml:space="preserve"> сентября </w:t>
+      </w:r>
+      <w:r>
+        <w:rPr>
+          <w:highlight w:val="yellow"/>
+        </w:rPr>
+        <w:t>2019г.</w:t>
+      </w:r>
+      <w:r>
+        <w:rPr/>
+        <w:t xml:space="preserve"> А.П. СОБОЛЕВ</w:t>
       </w:r>
     </w:p>
     <w:p>
@@ -1150,7 +1455,9 @@
     </w:p>
     <w:p>
       <w:r>
-        <w:rPr/>
+        <w:rPr>
+          <w:highlight w:val="yellow"/>
+        </w:rPr>
         <w:t>АГУТМ</w:t>
       </w:r>
     </w:p>
@@ -1162,7 +1469,9 @@
     </w:p>
     <w:p>
       <w:r>
-        <w:rPr/>
+        <w:rPr>
+          <w:highlight w:val="yellow"/>
+        </w:rPr>
         <w:t>ЛЭ5880</w:t>
       </w:r>
     </w:p>
@@ -1180,7 +1489,9 @@
     </w:p>
     <w:p>
       <w:r>
-        <w:rPr/>
+        <w:rPr>
+          <w:highlight w:val="yellow"/>
+        </w:rPr>
         <w:t>спецификации ЛЭ5880</w:t>
       </w:r>
     </w:p>
@@ -1226,7 +1537,37 @@
     <w:p>
       <w:r>
         <w:rPr/>
-        <w:t>Дата изготовления «03» октября 2019 г.</w:t>
+        <w:t>Дата изготовления «</w:t>
+      </w:r>
+      <w:r>
+        <w:rPr>
+          <w:highlight w:val="yellow"/>
+        </w:rPr>
+        <w:t>03</w:t>
+      </w:r>
+      <w:r>
+        <w:rPr/>
+        <w:t xml:space="preserve">» </w:t>
+      </w:r>
+      <w:r>
+        <w:rPr>
+          <w:highlight w:val="yellow"/>
+        </w:rPr>
+        <w:t>октября</w:t>
+      </w:r>
+      <w:r>
+        <w:rPr/>
+        <w:t xml:space="preserve"> 20</w:t>
+      </w:r>
+      <w:r>
+        <w:rPr>
+          <w:highlight w:val="yellow"/>
+        </w:rPr>
+        <w:t>19</w:t>
+      </w:r>
+      <w:r>
+        <w:rPr/>
+        <w:t xml:space="preserve"> г.</w:t>
       </w:r>
     </w:p>
     <w:p>
@@ -1250,8 +1591,34 @@
     </w:p>
     <w:p>
       <w:r>
-        <w:rPr/>
-        <w:t>[неразборчиво] АЭ5880-Ш зав. № 1С.8 упакован(а)</w:t>
+        <w:rPr>
+          <w:highlight w:val="yellow"/>
+        </w:rPr>
+        <w:t>[неразборчиво]</w:t>
+      </w:r>
+      <w:r>
+        <w:rPr/>
+        <w:t xml:space="preserve"> </w:t>
+      </w:r>
+      <w:r>
+        <w:rPr>
+          <w:highlight w:val="yellow"/>
+        </w:rPr>
+        <w:t>АЭ5880-Ш</w:t>
+      </w:r>
+      <w:r>
+        <w:rPr/>
+        <w:t xml:space="preserve"> зав. № </w:t>
+      </w:r>
+      <w:r>
+        <w:rPr>
+          <w:highlight w:val="yellow"/>
+        </w:rPr>
+        <w:t>1С.8</w:t>
+      </w:r>
+      <w:r>
+        <w:rPr/>
+        <w:t xml:space="preserve"> упакован(а)</w:t>
       </w:r>
     </w:p>
     <w:p>
@@ -1263,7 +1630,13 @@
     <w:p>
       <w:r>
         <w:rPr/>
-        <w:t>ФГУП «Комбинат «Электрохимприбор» согласно требованиям, предусмотренным ОСТ В 952183-2002</w:t>
+        <w:t xml:space="preserve">ФГУП «Комбинат «Электрохимприбор» согласно требованиям, предусмотренным </w:t>
+      </w:r>
+      <w:r>
+        <w:rPr>
+          <w:highlight w:val="yellow"/>
+        </w:rPr>
+        <w:t>ОСТ В 952183-2002</w:t>
       </w:r>
     </w:p>
     <w:p>
@@ -1274,14 +1647,50 @@
     </w:p>
     <w:p>
       <w:r>
-        <w:rPr/>
-        <w:t>[неразборчиво] опломбирован(а) ОТК и ВП Миноборонь России пломбами с оттисками клеем «___», «___».</w:t>
+        <w:rPr>
+          <w:highlight w:val="yellow"/>
+        </w:rPr>
+        <w:t>[неразборчиво]</w:t>
+      </w:r>
+      <w:r>
+        <w:rPr/>
+        <w:t xml:space="preserve"> опломбирован(а) ОТК и ВП Миноборонь России пломбами с оттисками клеем «</w:t>
+      </w:r>
+      <w:r>
+        <w:rPr>
+          <w:highlight w:val="yellow"/>
+        </w:rPr>
+        <w:t>___</w:t>
+      </w:r>
+      <w:r>
+        <w:rPr/>
+        <w:t>», «</w:t>
+      </w:r>
+      <w:r>
+        <w:rPr>
+          <w:highlight w:val="yellow"/>
+        </w:rPr>
+        <w:t>___</w:t>
+      </w:r>
+      <w:r>
+        <w:rPr/>
+        <w:t>».</w:t>
       </w:r>
     </w:p>
     <w:p>
       <w:r>
         <w:rPr/>
-        <w:t>Тара АЭ5880-Ш опломбирована ОТК и ВП Миноборонь России пломбами</w:t>
+        <w:t xml:space="preserve">Тара </w:t>
+      </w:r>
+      <w:r>
+        <w:rPr>
+          <w:highlight w:val="yellow"/>
+        </w:rPr>
+        <w:t>АЭ5880-Ш</w:t>
+      </w:r>
+      <w:r>
+        <w:rPr/>
+        <w:t xml:space="preserve"> опломбирована ОТК и ВП Миноборонь России пломбами</w:t>
       </w:r>
     </w:p>
     <w:p>
@@ -1293,19 +1702,79 @@
     <w:p>
       <w:r>
         <w:rPr/>
-        <w:t>с оттисками клеем «ОТК14», «★8».</w:t>
+        <w:t>с оттисками клеем «</w:t>
+      </w:r>
+      <w:r>
+        <w:rPr>
+          <w:highlight w:val="yellow"/>
+        </w:rPr>
+        <w:t>ОТК14</w:t>
+      </w:r>
+      <w:r>
+        <w:rPr/>
+        <w:t>», «</w:t>
+      </w:r>
+      <w:r>
+        <w:rPr>
+          <w:highlight w:val="yellow"/>
+        </w:rPr>
+        <w:t>★8</w:t>
+      </w:r>
+      <w:r>
+        <w:rPr/>
+        <w:t>».</w:t>
       </w:r>
     </w:p>
     <w:p>
       <w:r>
         <w:rPr/>
-        <w:t>Количество пломб на изделии ___ шт., на таре 2 шт.</w:t>
+        <w:t xml:space="preserve">Количество пломб на изделии </w:t>
+      </w:r>
+      <w:r>
+        <w:rPr>
+          <w:highlight w:val="yellow"/>
+        </w:rPr>
+        <w:t>___</w:t>
+      </w:r>
+      <w:r>
+        <w:rPr/>
+        <w:t xml:space="preserve"> шт., на таре </w:t>
+      </w:r>
+      <w:r>
+        <w:rPr>
+          <w:highlight w:val="yellow"/>
+        </w:rPr>
+        <w:t>2</w:t>
+      </w:r>
+      <w:r>
+        <w:rPr/>
+        <w:t xml:space="preserve"> шт.</w:t>
       </w:r>
     </w:p>
     <w:p>
       <w:r>
         <w:rPr/>
-        <w:t>Дата упаковывания «03» ОКТЯБРЯ 2019 г.</w:t>
+        <w:t>Дата упаковывания «</w:t>
+      </w:r>
+      <w:r>
+        <w:rPr>
+          <w:highlight w:val="yellow"/>
+        </w:rPr>
+        <w:t>03</w:t>
+      </w:r>
+      <w:r>
+        <w:rPr/>
+        <w:t>» ОКТЯБРЯ 20</w:t>
+      </w:r>
+      <w:r>
+        <w:rPr>
+          <w:highlight w:val="yellow"/>
+        </w:rPr>
+        <w:t>19</w:t>
+      </w:r>
+      <w:r>
+        <w:rPr/>
+        <w:t xml:space="preserve"> г.</w:t>
       </w:r>
     </w:p>
     <w:p>
@@ -1466,14 +1935,18 @@
           </w:tcPr>
           <w:p>
             <w:r>
-              <w:rPr/>
+              <w:rPr>
+                <w:highlight w:val="yellow"/>
+              </w:rPr>
               <w:t>26.08.21</w:t>
             </w:r>
             <w:r>
               <w:br/>
             </w:r>
             <w:r>
-              <w:rPr/>
+              <w:rPr>
+                <w:highlight w:val="yellow"/>
+              </w:rPr>
               <w:t>04.12.21</w:t>
             </w:r>
           </w:p>
@@ -1484,7 +1957,9 @@
           </w:tcPr>
           <w:p>
             <w:r>
-              <w:rPr/>
+              <w:rPr>
+                <w:highlight w:val="yellow"/>
+              </w:rPr>
               <w:t>—</w:t>
             </w:r>
           </w:p>
@@ -1495,14 +1970,18 @@
           </w:tcPr>
           <w:p>
             <w:r>
-              <w:rPr/>
+              <w:rPr>
+                <w:highlight w:val="yellow"/>
+              </w:rPr>
               <w:t>340</w:t>
             </w:r>
             <w:r>
               <w:br/>
             </w:r>
             <w:r>
-              <w:rPr/>
+              <w:rPr>
+                <w:highlight w:val="yellow"/>
+              </w:rPr>
               <w:t>305</w:t>
             </w:r>
           </w:p>
@@ -1603,7 +2082,9 @@
     <w:p/>
     <w:p>
       <w:r>
-        <w:rPr/>
+        <w:rPr>
+          <w:highlight w:val="yellow"/>
+        </w:rPr>
         <w:t>10. 12. 2019</w:t>
       </w:r>
     </w:p>
@@ -1634,7 +2115,17 @@
     <w:p>
       <w:r>
         <w:rPr/>
-        <w:t>КЛЕЯМ А1/274 - _ шт.</w:t>
+        <w:t xml:space="preserve">КЛЕЯМ А1/274 - </w:t>
+      </w:r>
+      <w:r>
+        <w:rPr>
+          <w:highlight w:val="yellow"/>
+        </w:rPr>
+        <w:t>_</w:t>
+      </w:r>
+      <w:r>
+        <w:rPr/>
+        <w:t xml:space="preserve"> шт.</w:t>
       </w:r>
     </w:p>
     <w:p>
@@ -5494,31 +5985,41 @@
     </w:p>
     <w:p>
       <w:r>
-        <w:rPr/>
+        <w:rPr>
+          <w:highlight w:val="yellow"/>
+        </w:rPr>
         <w:t>Границы:</w:t>
       </w:r>
     </w:p>
     <w:p>
       <w:r>
-        <w:rPr/>
+        <w:rPr>
+          <w:highlight w:val="yellow"/>
+        </w:rPr>
         <w:t>таблица 1</w:t>
       </w:r>
     </w:p>
     <w:p>
       <w:r>
-        <w:rPr/>
+        <w:rPr>
+          <w:highlight w:val="yellow"/>
+        </w:rPr>
         <w:t>таблица 2</w:t>
       </w:r>
     </w:p>
     <w:p>
       <w:r>
-        <w:rPr/>
+        <w:rPr>
+          <w:highlight w:val="yellow"/>
+        </w:rPr>
         <w:t>Герметичные стволовые части:</w:t>
       </w:r>
     </w:p>
     <w:p>
       <w:r>
-        <w:rPr/>
+        <w:rPr>
+          <w:highlight w:val="yellow"/>
+        </w:rPr>
         <w:t>силла PPC4-SC-1-2-B ГОСТ 364 215 75</w:t>
       </w:r>
     </w:p>
@@ -5527,13 +6028,17 @@
         <w:pStyle w:val="Heading1"/>
       </w:pPr>
       <w:r>
-        <w:rPr/>
+        <w:rPr>
+          <w:highlight w:val="yellow"/>
+        </w:rPr>
         <w:t>Страница технического документа</w:t>
       </w:r>
     </w:p>
     <w:p>
       <w:r>
-        <w:rPr/>
+        <w:rPr>
+          <w:highlight w:val="yellow"/>
+        </w:rPr>
         <w:t>Согласно ГОСТ 3642417-99</w:t>
       </w:r>
       <w:r>
@@ -5542,7 +6047,9 @@
     </w:p>
     <w:p>
       <w:r>
-        <w:rPr/>
+        <w:rPr>
+          <w:highlight w:val="yellow"/>
+        </w:rPr>
         <w:t>Согласно СНиП 23-05-95*3313-1-а-В ГОСТ 3642417-99</w:t>
       </w:r>
       <w:r>
@@ -5551,7 +6058,9 @@
     </w:p>
     <w:p>
       <w:r>
-        <w:rPr/>
+        <w:rPr>
+          <w:highlight w:val="yellow"/>
+        </w:rPr>
         <w:t>Согласно 2РиТиФБ4 ШАВ1В ГОСТ 3641261-99</w:t>
       </w:r>
       <w:r>
@@ -5560,7 +6069,9 @@
     </w:p>
     <w:p>
       <w:r>
-        <w:rPr/>
+        <w:rPr>
+          <w:highlight w:val="yellow"/>
+        </w:rPr>
         <w:t>Согласно А-СИР1ЕС Требования к параметрам ТПСС (допуск)</w:t>
       </w:r>
       <w:r>
@@ -5569,7 +6080,9 @@
     </w:p>
     <w:p>
       <w:r>
-        <w:rPr/>
+        <w:rPr>
+          <w:highlight w:val="yellow"/>
+        </w:rPr>
         <w:t>Согласно СНиП 23-01-95*3313-1-б-В ГОСТ 3642417-99</w:t>
       </w:r>
       <w:r>
@@ -5578,7 +6091,9 @@
     </w:p>
     <w:p>
       <w:r>
-        <w:rPr/>
+        <w:rPr>
+          <w:highlight w:val="yellow"/>
+        </w:rPr>
         <w:t>Согласно СНиП 23-01-95*3313-1-с-В ГОСТ 3642417-99</w:t>
       </w:r>
       <w:r>
@@ -5587,7 +6102,9 @@
     </w:p>
     <w:p>
       <w:r>
-        <w:rPr/>
+        <w:rPr>
+          <w:highlight w:val="yellow"/>
+        </w:rPr>
         <w:t>Датировано в соответствии с данными эксплуатационного паспорта</w:t>
       </w:r>
     </w:p>
@@ -5684,8 +6201,20 @@
     <w:p/>
     <w:p>
       <w:r>
-        <w:rPr/>
-        <w:t>03 октября 2019г.</w:t>
+        <w:rPr>
+          <w:highlight w:val="yellow"/>
+        </w:rPr>
+        <w:t>03</w:t>
+      </w:r>
+      <w:r>
+        <w:rPr/>
+        <w:t xml:space="preserve"> октября </w:t>
+      </w:r>
+      <w:r>
+        <w:rPr>
+          <w:highlight w:val="yellow"/>
+        </w:rPr>
+        <w:t>2019г.</w:t>
       </w:r>
     </w:p>
     <w:p>
@@ -5699,14 +6228,18 @@
     </w:p>
     <w:p>
       <w:r>
-        <w:rPr/>
+        <w:rPr>
+          <w:highlight w:val="yellow"/>
+        </w:rPr>
         <w:t xml:space="preserve">[неразборчиво] утилизация агрегата (гермента) на [неразборчиво] АО «ТехноТон» (Утилизированные </w:t>
       </w:r>
       <w:r>
         <w:br/>
       </w:r>
       <w:r>
-        <w:rPr/>
+        <w:rPr>
+          <w:highlight w:val="yellow"/>
+        </w:rPr>
         <w:t xml:space="preserve"> АГРУ 354-2016)</w:t>
       </w:r>
     </w:p>
@@ -5715,7 +6248,9 @@
         <w:pStyle w:val="Heading1"/>
       </w:pPr>
       <w:r>
-        <w:rPr/>
+        <w:rPr>
+          <w:highlight w:val="yellow"/>
+        </w:rPr>
         <w:t>[неразборчиво]</w:t>
       </w:r>
     </w:p>

</xml_diff>